<commit_message>
Add volleyball competitions and per-match reports
</commit_message>
<xml_diff>
--- a/public/documents/HZISL_Basketball_Rules_2026-27.docx
+++ b/public/documents/HZISL_Basketball_Rules_2026-27.docx
@@ -93,7 +93,7 @@
           <w:color w:val="526173"/>
           <w:sz w:val="19"/>
         </w:rPr>
-        <w:t>Season 2026–27  •  Version 1.0  •  Effective 5 September 2026</w:t>
+        <w:t>Season 2026–27  •  Version 1.1  •  Effective 5 September 2026</w:t>
       </w:r>
     </w:p>
     <w:tbl>
@@ -151,7 +151,7 @@
                 <w:color w:val="0B2545"/>
                 <w:sz w:val="20"/>
               </w:rPr>
-              <w:t>5-a-side • 4 × 8-minute quarters • 4-minute quarter intervals • 10-minute half-time • 3-minute overtime periods.</w:t>
+              <w:t>5-a-side • unlimited substitutions • 4 × 8-minute quarters • 4-minute quarter intervals • 10-minute half-time • 3-minute overtime periods.</w:t>
             </w:r>
           </w:p>
         </w:tc>
@@ -905,7 +905,7 @@
           <w:color w:val="0B2545"/>
           <w:sz w:val="22"/>
         </w:rPr>
-        <w:t>Substitutions are unlimited among the 12 named players and occur during a substitution opportunity after the scorer’s signal and referee authorization.</w:t>
+        <w:t>There is no limit on the number of substitutions. Any of the 12 named players may enter during a substitution opportunity after the scorer’s signal and referee authorization.</w:t>
       </w:r>
     </w:p>
     <w:p>
@@ -1594,7 +1594,7 @@
         <w:color w:val="526173"/>
         <w:sz w:val="17"/>
       </w:rPr>
-      <w:t>Official competition document  •  v1.0  •  15 August 2026</w:t>
+      <w:t>Official competition document  •  v1.1  •  15 August 2026</w:t>
     </w:r>
     <w:r>
       <w:rPr>

</xml_diff>